<commit_message>
Create lab7 project and setup with java files
</commit_message>
<xml_diff>
--- a/AIML intro WS.docx
+++ b/AIML intro WS.docx
@@ -101,14 +101,7 @@
         <w:rPr>
           <w:rFonts w:hint="eastAsia"/>
         </w:rPr>
-        <w:t xml:space="preserve">ake </w:t>
-      </w:r>
-      <w:proofErr w:type="gramStart"/>
-      <w:r>
-        <w:rPr>
-          <w:rFonts w:hint="eastAsia"/>
-        </w:rPr>
-        <w:t xml:space="preserve">non </w:t>
+        <w:t xml:space="preserve">ake non </w:t>
       </w:r>
       <w:r>
         <w:t>L</w:t>
@@ -131,7 +124,6 @@
       <w:r>
         <w:t>r</w:t>
       </w:r>
-      <w:proofErr w:type="gramEnd"/>
       <w:r>
         <w:rPr>
           <w:rFonts w:hint="eastAsia"/>
@@ -162,35 +154,7 @@
         <w:rPr>
           <w:rFonts w:hint="eastAsia"/>
         </w:rPr>
-        <w:t>Scikit-learn (</w:t>
-      </w:r>
-      <w:proofErr w:type="gramStart"/>
-      <w:r>
-        <w:rPr>
-          <w:rFonts w:hint="eastAsia"/>
-        </w:rPr>
-        <w:t>open source</w:t>
-      </w:r>
-      <w:proofErr w:type="gramEnd"/>
-      <w:r>
-        <w:rPr>
-          <w:rFonts w:hint="eastAsia"/>
-        </w:rPr>
-        <w:t xml:space="preserve"> </w:t>
-      </w:r>
-      <w:proofErr w:type="spellStart"/>
-      <w:r>
-        <w:rPr>
-          <w:rFonts w:hint="eastAsia"/>
-        </w:rPr>
-        <w:t>Ml</w:t>
-      </w:r>
-      <w:proofErr w:type="spellEnd"/>
-      <w:r>
-        <w:rPr>
-          <w:rFonts w:hint="eastAsia"/>
-        </w:rPr>
-        <w:t xml:space="preserve"> for all)</w:t>
+        <w:t>Scikit-learn (open source Ml for all)</w:t>
       </w:r>
     </w:p>
     <w:p>
@@ -232,16 +196,8 @@
         <w:rPr>
           <w:rFonts w:hint="eastAsia"/>
         </w:rPr>
-        <w:t xml:space="preserve">TensorFlow vs </w:t>
-      </w:r>
-      <w:proofErr w:type="spellStart"/>
-      <w:r>
-        <w:rPr>
-          <w:rFonts w:hint="eastAsia"/>
-        </w:rPr>
-        <w:t>pytorch</w:t>
-      </w:r>
-      <w:proofErr w:type="spellEnd"/>
+        <w:t>TensorFlow vs pytorch</w:t>
+      </w:r>
     </w:p>
     <w:p>
       <w:r>
@@ -255,11 +211,29 @@
       </w:r>
     </w:p>
     <w:p>
+      <w:r>
+        <w:t>E</w:t>
+      </w:r>
+      <w:r>
+        <w:rPr>
+          <w:rFonts w:hint="eastAsia"/>
+        </w:rPr>
+        <w:t>asier / more complicate</w:t>
+      </w:r>
+    </w:p>
+    <w:p/>
+    <w:p>
       <w:pPr>
         <w:rPr>
           <w:rFonts w:hint="eastAsia"/>
         </w:rPr>
       </w:pPr>
+      <w:r>
+        <w:rPr>
+          <w:rFonts w:hint="eastAsia"/>
+        </w:rPr>
+        <w:t>Kaggle competition</w:t>
+      </w:r>
     </w:p>
     <w:sectPr>
       <w:pgSz w:w="12240" w:h="15840"/>

</xml_diff>